<commit_message>
Keep pricing to section 6
The executive summary carried a commercial summary table repeating the capital
cost, payment schedule and maintenance charge. Removed: the figures now appear
once, where a reader looking for them will go.

Co-Authored-By: Claude Opus 5 (1M context) <noreply@anthropic.com>
Claude-Session: https://claude.ai/code/session_01SHwrs6M9bEAzCZuB3mT22e
</commit_message>
<xml_diff>
--- a/docs/KMCP_Capability_and_Security.docx
+++ b/docs/KMCP_Capability_and_Security.docx
@@ -1053,316 +1053,6 @@
       <w:pPr>
         <w:spacing w:after="80"/>
       </w:pPr>
-    </w:p>
-    <w:p>
-      <w:pPr>
-        <w:pStyle w:val="Heading3"/>
-      </w:pPr>
-      <w:r>
-        <w:t>Commercial summary</w:t>
-      </w:r>
-    </w:p>
-    <w:tbl>
-      <w:tblPr>
-        <w:tblStyle w:val="TableGrid"/>
-        <w:tblW w:type="auto" w:w="0"/>
-        <w:jc w:val="center"/>
-        <w:tblLook w:firstColumn="1" w:firstRow="1" w:lastColumn="0" w:lastRow="0" w:noHBand="0" w:noVBand="1" w:val="04A0"/>
-      </w:tblPr>
-      <w:tblGrid>
-        <w:gridCol w:w="4824"/>
-        <w:gridCol w:w="4824"/>
-      </w:tblGrid>
-      <w:tr>
-        <w:tc>
-          <w:tcPr>
-            <w:tcW w:type="dxa" w:w="3312"/>
-            <w:shd w:val="clear" w:fill="0C6E56"/>
-          </w:tcPr>
-          <w:p>
-            <w:pPr>
-              <w:spacing w:before="40" w:after="40"/>
-            </w:pPr>
-            <w:r/>
-            <w:r>
-              <w:rPr>
-                <w:b/>
-                <w:color w:val="FFFFFF"/>
-                <w:sz w:val="18"/>
-              </w:rPr>
-            </w:r>
-          </w:p>
-        </w:tc>
-        <w:tc>
-          <w:tcPr>
-            <w:tcW w:type="dxa" w:w="6048"/>
-            <w:shd w:val="clear" w:fill="0C6E56"/>
-          </w:tcPr>
-          <w:p>
-            <w:pPr>
-              <w:spacing w:before="40" w:after="40"/>
-            </w:pPr>
-            <w:r/>
-            <w:r>
-              <w:rPr>
-                <w:b/>
-                <w:color w:val="FFFFFF"/>
-                <w:sz w:val="18"/>
-              </w:rPr>
-            </w:r>
-          </w:p>
-        </w:tc>
-      </w:tr>
-      <w:tr>
-        <w:tc>
-          <w:tcPr>
-            <w:tcW w:type="dxa" w:w="3312"/>
-          </w:tcPr>
-          <w:p>
-            <w:pPr>
-              <w:spacing w:before="40" w:after="40"/>
-            </w:pPr>
-            <w:r/>
-            <w:r>
-              <w:rPr>
-                <w:b w:val="0"/>
-                <w:sz w:val="18"/>
-              </w:rPr>
-              <w:t>Capital cost</w:t>
-            </w:r>
-          </w:p>
-        </w:tc>
-        <w:tc>
-          <w:tcPr>
-            <w:tcW w:type="dxa" w:w="6048"/>
-          </w:tcPr>
-          <w:p>
-            <w:pPr>
-              <w:spacing w:before="40" w:after="40"/>
-            </w:pPr>
-            <w:r/>
-            <w:r>
-              <w:rPr>
-                <w:b w:val="0"/>
-                <w:sz w:val="18"/>
-              </w:rPr>
-              <w:t>Rs 1,50,00,000 plus GST</w:t>
-            </w:r>
-          </w:p>
-        </w:tc>
-      </w:tr>
-      <w:tr>
-        <w:tc>
-          <w:tcPr>
-            <w:tcW w:type="dxa" w:w="3312"/>
-            <w:shd w:val="clear" w:fill="F2F5F9"/>
-          </w:tcPr>
-          <w:p>
-            <w:pPr>
-              <w:spacing w:before="40" w:after="40"/>
-            </w:pPr>
-            <w:r/>
-            <w:r>
-              <w:rPr>
-                <w:b w:val="0"/>
-                <w:sz w:val="18"/>
-              </w:rPr>
-              <w:t>Payment</w:t>
-            </w:r>
-          </w:p>
-        </w:tc>
-        <w:tc>
-          <w:tcPr>
-            <w:tcW w:type="dxa" w:w="6048"/>
-            <w:shd w:val="clear" w:fill="F2F5F9"/>
-          </w:tcPr>
-          <w:p>
-            <w:pPr>
-              <w:spacing w:before="40" w:after="40"/>
-            </w:pPr>
-            <w:r/>
-            <w:r>
-              <w:rPr>
-                <w:b w:val="0"/>
-                <w:sz w:val="18"/>
-              </w:rPr>
-              <w:t>50% on award, 50% on delivery and successful testing</w:t>
-            </w:r>
-          </w:p>
-        </w:tc>
-      </w:tr>
-      <w:tr>
-        <w:tc>
-          <w:tcPr>
-            <w:tcW w:type="dxa" w:w="3312"/>
-          </w:tcPr>
-          <w:p>
-            <w:pPr>
-              <w:spacing w:before="40" w:after="40"/>
-            </w:pPr>
-            <w:r/>
-            <w:r>
-              <w:rPr>
-                <w:b w:val="0"/>
-                <w:sz w:val="18"/>
-              </w:rPr>
-              <w:t>Invoice terms</w:t>
-            </w:r>
-          </w:p>
-        </w:tc>
-        <w:tc>
-          <w:tcPr>
-            <w:tcW w:type="dxa" w:w="6048"/>
-          </w:tcPr>
-          <w:p>
-            <w:pPr>
-              <w:spacing w:before="40" w:after="40"/>
-            </w:pPr>
-            <w:r/>
-            <w:r>
-              <w:rPr>
-                <w:b w:val="0"/>
-                <w:sz w:val="18"/>
-              </w:rPr>
-              <w:t>Payable within 15 days of invoice submission</w:t>
-            </w:r>
-          </w:p>
-        </w:tc>
-      </w:tr>
-      <w:tr>
-        <w:tc>
-          <w:tcPr>
-            <w:tcW w:type="dxa" w:w="3312"/>
-            <w:shd w:val="clear" w:fill="F2F5F9"/>
-          </w:tcPr>
-          <w:p>
-            <w:pPr>
-              <w:spacing w:before="40" w:after="40"/>
-            </w:pPr>
-            <w:r/>
-            <w:r>
-              <w:rPr>
-                <w:b w:val="0"/>
-                <w:sz w:val="18"/>
-              </w:rPr>
-              <w:t>Annual maintenance</w:t>
-            </w:r>
-          </w:p>
-        </w:tc>
-        <w:tc>
-          <w:tcPr>
-            <w:tcW w:type="dxa" w:w="6048"/>
-            <w:shd w:val="clear" w:fill="F2F5F9"/>
-          </w:tcPr>
-          <w:p>
-            <w:pPr>
-              <w:spacing w:before="40" w:after="40"/>
-            </w:pPr>
-            <w:r/>
-            <w:r>
-              <w:rPr>
-                <w:b w:val="0"/>
-                <w:sz w:val="18"/>
-              </w:rPr>
-              <w:t>Rs 25,00,000 per annum plus GST, billed half-yearly in advance</w:t>
-            </w:r>
-          </w:p>
-        </w:tc>
-      </w:tr>
-      <w:tr>
-        <w:tc>
-          <w:tcPr>
-            <w:tcW w:type="dxa" w:w="3312"/>
-          </w:tcPr>
-          <w:p>
-            <w:pPr>
-              <w:spacing w:before="40" w:after="40"/>
-            </w:pPr>
-            <w:r/>
-            <w:r>
-              <w:rPr>
-                <w:b w:val="0"/>
-                <w:sz w:val="18"/>
-              </w:rPr>
-              <w:t>AMC escalation</w:t>
-            </w:r>
-          </w:p>
-        </w:tc>
-        <w:tc>
-          <w:tcPr>
-            <w:tcW w:type="dxa" w:w="6048"/>
-          </w:tcPr>
-          <w:p>
-            <w:pPr>
-              <w:spacing w:before="40" w:after="40"/>
-            </w:pPr>
-            <w:r/>
-            <w:r>
-              <w:rPr>
-                <w:b w:val="0"/>
-                <w:sz w:val="18"/>
-              </w:rPr>
-              <w:t>Rs 2,50,000 added each year, being 10% of the initial annual charge</w:t>
-            </w:r>
-          </w:p>
-        </w:tc>
-      </w:tr>
-      <w:tr>
-        <w:tc>
-          <w:tcPr>
-            <w:tcW w:type="dxa" w:w="3312"/>
-            <w:shd w:val="clear" w:fill="F2F5F9"/>
-          </w:tcPr>
-          <w:p>
-            <w:pPr>
-              <w:spacing w:before="40" w:after="40"/>
-            </w:pPr>
-            <w:r/>
-            <w:r>
-              <w:rPr>
-                <w:b w:val="0"/>
-                <w:sz w:val="18"/>
-              </w:rPr>
-              <w:t>Hardware and post-delivery enhancements</w:t>
-            </w:r>
-          </w:p>
-        </w:tc>
-        <w:tc>
-          <w:tcPr>
-            <w:tcW w:type="dxa" w:w="6048"/>
-            <w:shd w:val="clear" w:fill="F2F5F9"/>
-          </w:tcPr>
-          <w:p>
-            <w:pPr>
-              <w:spacing w:before="40" w:after="40"/>
-            </w:pPr>
-            <w:r/>
-            <w:r>
-              <w:rPr>
-                <w:b w:val="0"/>
-                <w:sz w:val="18"/>
-              </w:rPr>
-              <w:t>Charged on actuals</w:t>
-            </w:r>
-          </w:p>
-        </w:tc>
-      </w:tr>
-    </w:tbl>
-    <w:p>
-      <w:pPr>
-        <w:spacing w:after="80"/>
-      </w:pPr>
-    </w:p>
-    <w:p>
-      <w:r>
-        <w:rPr>
-          <w:b w:val="0"/>
-          <w:i/>
-          <w:color w:val="5C6675"/>
-          <w:sz w:val="19"/>
-        </w:rPr>
-        <w:t>Set out in full in section 6.</w:t>
-      </w:r>
     </w:p>
     <w:p>
       <w:r>

</xml_diff>